<commit_message>
Update .DS_Store files and proposals for improved organization and content
</commit_message>
<xml_diff>
--- a/04_documents/proposals/V1/Campari-Proposta-Comercial-FINAL-Preço-fixo-pacotes.docx
+++ b/04_documents/proposals/V1/Campari-Proposta-Comercial-FINAL-Preço-fixo-pacotes.docx
@@ -138,7 +138,7 @@
           <w:b/>
           <w:bCs/>
         </w:rPr>
-        <w:t xml:space="preserve">3.5x</w:t>
+        <w:t xml:space="preserve">4.87x</w:t>
       </w:r>
       <w:r>
         <w:t xml:space="preserve">.</w:t>
@@ -2602,7 +2602,7 @@
                 <w:b/>
                 <w:bCs/>
               </w:rPr>
-              <w:t xml:space="preserve">3-4 meses (média)</w:t>
+              <w:t xml:space="preserve">2-3 meses (média)</w:t>
             </w:r>
           </w:p>
         </w:tc>
@@ -2685,7 +2685,7 @@
         <w:rPr>
           <w:rStyle w:val="VerbatimChar"/>
         </w:rPr>
-        <w:t xml:space="preserve">ROI Y1:                     3.5x</w:t>
+        <w:t xml:space="preserve">ROI Y1:                     4.87x</w:t>
       </w:r>
       <w:r>
         <w:br/>
@@ -2694,7 +2694,7 @@
         <w:rPr>
           <w:rStyle w:val="VerbatimChar"/>
         </w:rPr>
-        <w:t xml:space="preserve">Payback period:             3-4 meses</w:t>
+        <w:t xml:space="preserve">Payback period:             2-3 meses</w:t>
       </w:r>
     </w:p>
     <w:p>
@@ -3111,7 +3111,7 @@
         <w:t xml:space="preserve"> </w:t>
       </w:r>
       <w:r>
-        <w:t xml:space="preserve">Campari e outras empresas buscando transformação real com impacto mensurável em 12 meses (resultado esperado: 3.5x ROI, R$ 640k+ impacto)</w:t>
+        <w:t xml:space="preserve">Campari e outras empresas buscando transformação real com impacto mensurável em 12 meses (resultado esperado: 4.87x ROI, R$ 640k+ impacto)</w:t>
       </w:r>
     </w:p>
     <w:p>
@@ -3320,7 +3320,7 @@
         <w:t xml:space="preserve"> </w:t>
       </w:r>
       <w:r>
-        <w:t xml:space="preserve">- ✅ Quer RoI demonstrável (3.5x esperado)</w:t>
+        <w:t xml:space="preserve">- ✅ Quer RoI demonstrável (4.87x esperado)</w:t>
       </w:r>
       <w:r>
         <w:t xml:space="preserve"> </w:t>
@@ -3473,7 +3473,7 @@
         <w:t xml:space="preserve"> </w:t>
       </w:r>
       <w:r>
-        <w:t xml:space="preserve">Revisamos estimativas de impacto (R$ 642.5k, 3.5x ROI) contra realidade de Campari</w:t>
+        <w:t xml:space="preserve">Revisamos estimativas de impacto (R$ 642.5k, 4.87x ROI) contra realidade de Campari</w:t>
       </w:r>
     </w:p>
     <w:p>

</xml_diff>